<commit_message>
Day 1: Switch to terminal UI and fix empty table rows in design report
- Change both implementations from GUI to interactive terminal (Java Scanner,
  Node.js readline) — keeps focus on language comparison rather than rendering
- Fix empty rows in all tables (table was pre-allocating rows then adding more)
- Update README to reflect terminal-based approach
</commit_message>
<xml_diff>
--- a/Pelushi_Peng_MSCS632_Residency_Day1_Design.docx
+++ b/Pelushi_Peng_MSCS632_Residency_Day1_Design.docx
@@ -159,7 +159,7 @@
           <w:b w:val="0"/>
           <w:sz w:val="24"/>
         </w:rPr>
-        <w:t>This document presents the initial planning and design for a Collaborative To-Do List Application developed as part of the MSCS-632 Residency Weekend Group Project. The application will be implemented independently in two programming languages — Java and JavaScript — with functionally identical behavior but language-specific approaches to object modeling, data storage, concurrency, and user interface construction. This report outlines the application architecture, data model, graphical user interface design, team role assignments, project timeline, and anticipated language-specific challenges.</w:t>
+        <w:t>This document presents the initial planning and design for a Collaborative To-Do List Application developed as part of the MSCS-632 Residency Weekend Group Project. The application will be implemented independently in two programming languages — Java and JavaScript — with functionally identical behavior delivered through an interactive terminal interface. This report outlines the application architecture, data model, terminal UI design, team role assignments, project timeline, and anticipated language-specific challenges.</w:t>
       </w:r>
     </w:p>
     <w:p>
@@ -213,7 +213,7 @@
           <w:b w:val="0"/>
           <w:sz w:val="24"/>
         </w:rPr>
-        <w:t>Both the Java and JavaScript implementations will expose a graphical user interface (GUI) with a consistent layout — a user panel, a task list panel with filtering controls, and a task detail/edit area. Although the visual rendering differs between the platforms (JavaFX desktop vs. browser-based HTML/CSS), the functional layout and user experience will be equivalent.</w:t>
+        <w:t>Both the Java and JavaScript implementations will run as interactive terminal applications. Users navigate a text-based menu driven by numbered options, entering commands to manage tasks and switch between user contexts. The terminal interface keeps the focus on language-level design decisions — type systems, concurrency models, and data representation — rather than on visual rendering frameworks, making the cross-language comparison clearer and more direct.</w:t>
       </w:r>
     </w:p>
     <w:p>
@@ -264,9 +264,6 @@
           <w:sz w:val="24"/>
         </w:rPr>
       </w:r>
-    </w:p>
-    <w:p>
-      <w:r/>
     </w:p>
     <w:p>
       <w:pPr>
@@ -364,66 +361,6 @@
           <w:tcPr>
             <w:tcW w:type="dxa" w:w="3120"/>
           </w:tcPr>
-          <w:p/>
-        </w:tc>
-        <w:tc>
-          <w:tcPr>
-            <w:tcW w:type="dxa" w:w="3120"/>
-          </w:tcPr>
-          <w:p/>
-        </w:tc>
-        <w:tc>
-          <w:tcPr>
-            <w:tcW w:type="dxa" w:w="3120"/>
-          </w:tcPr>
-          <w:p/>
-        </w:tc>
-      </w:tr>
-      <w:tr>
-        <w:tc>
-          <w:tcPr>
-            <w:tcW w:type="dxa" w:w="3120"/>
-          </w:tcPr>
-          <w:p/>
-        </w:tc>
-        <w:tc>
-          <w:tcPr>
-            <w:tcW w:type="dxa" w:w="3120"/>
-          </w:tcPr>
-          <w:p/>
-        </w:tc>
-        <w:tc>
-          <w:tcPr>
-            <w:tcW w:type="dxa" w:w="3120"/>
-          </w:tcPr>
-          <w:p/>
-        </w:tc>
-      </w:tr>
-      <w:tr>
-        <w:tc>
-          <w:tcPr>
-            <w:tcW w:type="dxa" w:w="3120"/>
-          </w:tcPr>
-          <w:p/>
-        </w:tc>
-        <w:tc>
-          <w:tcPr>
-            <w:tcW w:type="dxa" w:w="3120"/>
-          </w:tcPr>
-          <w:p/>
-        </w:tc>
-        <w:tc>
-          <w:tcPr>
-            <w:tcW w:type="dxa" w:w="3120"/>
-          </w:tcPr>
-          <w:p/>
-        </w:tc>
-      </w:tr>
-      <w:tr>
-        <w:tc>
-          <w:tcPr>
-            <w:tcW w:type="dxa" w:w="3120"/>
-          </w:tcPr>
           <w:p>
             <w:r>
               <w:rPr>
@@ -508,7 +445,7 @@
                 <w:b w:val="0"/>
                 <w:sz w:val="22"/>
               </w:rPr>
-              <w:t>Display name shown in the UI</w:t>
+              <w:t>Display name shown in menus</w:t>
             </w:r>
           </w:p>
         </w:tc>
@@ -660,166 +597,6 @@
               <w:t>Description</w:t>
             </w:r>
           </w:p>
-        </w:tc>
-      </w:tr>
-      <w:tr>
-        <w:tc>
-          <w:tcPr>
-            <w:tcW w:type="dxa" w:w="3120"/>
-          </w:tcPr>
-          <w:p/>
-        </w:tc>
-        <w:tc>
-          <w:tcPr>
-            <w:tcW w:type="dxa" w:w="3120"/>
-          </w:tcPr>
-          <w:p/>
-        </w:tc>
-        <w:tc>
-          <w:tcPr>
-            <w:tcW w:type="dxa" w:w="3120"/>
-          </w:tcPr>
-          <w:p/>
-        </w:tc>
-      </w:tr>
-      <w:tr>
-        <w:tc>
-          <w:tcPr>
-            <w:tcW w:type="dxa" w:w="3120"/>
-          </w:tcPr>
-          <w:p/>
-        </w:tc>
-        <w:tc>
-          <w:tcPr>
-            <w:tcW w:type="dxa" w:w="3120"/>
-          </w:tcPr>
-          <w:p/>
-        </w:tc>
-        <w:tc>
-          <w:tcPr>
-            <w:tcW w:type="dxa" w:w="3120"/>
-          </w:tcPr>
-          <w:p/>
-        </w:tc>
-      </w:tr>
-      <w:tr>
-        <w:tc>
-          <w:tcPr>
-            <w:tcW w:type="dxa" w:w="3120"/>
-          </w:tcPr>
-          <w:p/>
-        </w:tc>
-        <w:tc>
-          <w:tcPr>
-            <w:tcW w:type="dxa" w:w="3120"/>
-          </w:tcPr>
-          <w:p/>
-        </w:tc>
-        <w:tc>
-          <w:tcPr>
-            <w:tcW w:type="dxa" w:w="3120"/>
-          </w:tcPr>
-          <w:p/>
-        </w:tc>
-      </w:tr>
-      <w:tr>
-        <w:tc>
-          <w:tcPr>
-            <w:tcW w:type="dxa" w:w="3120"/>
-          </w:tcPr>
-          <w:p/>
-        </w:tc>
-        <w:tc>
-          <w:tcPr>
-            <w:tcW w:type="dxa" w:w="3120"/>
-          </w:tcPr>
-          <w:p/>
-        </w:tc>
-        <w:tc>
-          <w:tcPr>
-            <w:tcW w:type="dxa" w:w="3120"/>
-          </w:tcPr>
-          <w:p/>
-        </w:tc>
-      </w:tr>
-      <w:tr>
-        <w:tc>
-          <w:tcPr>
-            <w:tcW w:type="dxa" w:w="3120"/>
-          </w:tcPr>
-          <w:p/>
-        </w:tc>
-        <w:tc>
-          <w:tcPr>
-            <w:tcW w:type="dxa" w:w="3120"/>
-          </w:tcPr>
-          <w:p/>
-        </w:tc>
-        <w:tc>
-          <w:tcPr>
-            <w:tcW w:type="dxa" w:w="3120"/>
-          </w:tcPr>
-          <w:p/>
-        </w:tc>
-      </w:tr>
-      <w:tr>
-        <w:tc>
-          <w:tcPr>
-            <w:tcW w:type="dxa" w:w="3120"/>
-          </w:tcPr>
-          <w:p/>
-        </w:tc>
-        <w:tc>
-          <w:tcPr>
-            <w:tcW w:type="dxa" w:w="3120"/>
-          </w:tcPr>
-          <w:p/>
-        </w:tc>
-        <w:tc>
-          <w:tcPr>
-            <w:tcW w:type="dxa" w:w="3120"/>
-          </w:tcPr>
-          <w:p/>
-        </w:tc>
-      </w:tr>
-      <w:tr>
-        <w:tc>
-          <w:tcPr>
-            <w:tcW w:type="dxa" w:w="3120"/>
-          </w:tcPr>
-          <w:p/>
-        </w:tc>
-        <w:tc>
-          <w:tcPr>
-            <w:tcW w:type="dxa" w:w="3120"/>
-          </w:tcPr>
-          <w:p/>
-        </w:tc>
-        <w:tc>
-          <w:tcPr>
-            <w:tcW w:type="dxa" w:w="3120"/>
-          </w:tcPr>
-          <w:p/>
-        </w:tc>
-      </w:tr>
-      <w:tr>
-        <w:tc>
-          <w:tcPr>
-            <w:tcW w:type="dxa" w:w="3120"/>
-          </w:tcPr>
-          <w:p/>
-        </w:tc>
-        <w:tc>
-          <w:tcPr>
-            <w:tcW w:type="dxa" w:w="3120"/>
-          </w:tcPr>
-          <w:p/>
-        </w:tc>
-        <w:tc>
-          <w:tcPr>
-            <w:tcW w:type="dxa" w:w="3120"/>
-          </w:tcPr>
-          <w:p/>
         </w:tc>
       </w:tr>
       <w:tr>
@@ -1221,7 +998,7 @@
           <w:b w:val="0"/>
           <w:sz w:val="24"/>
         </w:rPr>
-        <w:t>In Java, both entities will be modeled as strongly typed classes with private fields and public getter/setter methods, following standard OOP encapsulation. Enumerations will be used for Category and Status. In JavaScript, entities will be represented as plain objects stored in JSON format, with category and status values as string constants. Both implementations will maintain an in-memory collection of users and tasks during runtime.</w:t>
+        <w:t>In Java, both entities will be modeled as strongly typed classes with private fields and public getter/setter methods, following standard OOP encapsulation. Enumerations will be used for Category and Status. In JavaScript, entities will be represented as plain objects stored as JSON-compatible structures, with category and status values as string constants. Both implementations will maintain an in-memory collection of users and tasks during runtime.</w:t>
       </w:r>
     </w:p>
     <w:p>
@@ -1245,7 +1022,7 @@
           <w:b/>
           <w:sz w:val="24"/>
         </w:rPr>
-        <w:t>Graphical User Interface Design</w:t>
+        <w:t>Terminal Interface Design</w:t>
       </w:r>
     </w:p>
     <w:p>
@@ -1260,7 +1037,7 @@
           <w:b w:val="0"/>
           <w:sz w:val="24"/>
         </w:rPr>
-        <w:t>Both implementations will use a three-panel layout that separates user management, task listing, and task detail entry. The layout is designed to mirror each other across platforms so that the same core workflow applies regardless of language.</w:t>
+        <w:t>Both implementations will present an identical menu structure to the user. On launch, the application prompts for a user selection or allows creating a new user. Once a user is active, a main menu is displayed with numbered options for all task operations. The layout below represents the shared terminal flow for both languages.</w:t>
       </w:r>
     </w:p>
     <w:p>
@@ -1284,35 +1061,46 @@
           <w:b w:val="0"/>
           <w:sz w:val="18"/>
         </w:rPr>
-        <w:t>┌──────────────────┬────────────────────────────────────┐</w:t>
+        <w:t>=== Collaborative To-Do List ===</w:t>
         <w:br/>
-        <w:t>│  Users           │  Task List              [+ Add]    │</w:t>
         <w:br/>
-        <w:t>│  ─────────────── │  ──────────────────────────────    │</w:t>
+        <w:t>Select user:</w:t>
         <w:br/>
-        <w:t>│  ● Xhon Pelushi  │  ☐ Buy groceries   SHOPPING  [↓]  │</w:t>
+        <w:t xml:space="preserve">  1. Xhon Pelushi</w:t>
         <w:br/>
-        <w:t>│  ○ Sikun Peng    │  ✓ Write report    WORK      [↓]  │</w:t>
+        <w:t xml:space="preserve">  2. Sikun Peng</w:t>
         <w:br/>
-        <w:t>│  [+ Add User]    │  ◌ Fix login bug   WORK      [↓]  │</w:t>
+        <w:t xml:space="preserve">  3. Add new user</w:t>
         <w:br/>
-        <w:t>│                  │                                    │</w:t>
+        <w:t>&gt; 1</w:t>
         <w:br/>
-        <w:t>│  Filter:         │  ────── Task Detail ─────────────  │</w:t>
         <w:br/>
-        <w:t>│  Category [▾]    │  Title:       [_______________]    │</w:t>
+        <w:t>Logged in as: Xhon Pelushi</w:t>
         <w:br/>
-        <w:t>│  Status   [▾]    │  Category:    [▾ WORK        ]    │</w:t>
         <w:br/>
-        <w:t>│                  │  Status:      [▾ PENDING     ]    │</w:t>
+        <w:t>=== Main Menu ===</w:t>
         <w:br/>
-        <w:t>│                  │  Assign to:   [▾ Select User ]    │</w:t>
+        <w:t xml:space="preserve">  1. View all tasks</w:t>
         <w:br/>
-        <w:t>│                  │  Description: [_______________]    │</w:t>
+        <w:t xml:space="preserve">  2. View my tasks</w:t>
         <w:br/>
-        <w:t>│                  │               [Save]  [Cancel]     │</w:t>
+        <w:t xml:space="preserve">  3. Add task</w:t>
         <w:br/>
-        <w:t>└──────────────────┴────────────────────────────────────┘</w:t>
+        <w:t xml:space="preserve">  4. Edit task</w:t>
+        <w:br/>
+        <w:t xml:space="preserve">  5. Mark task complete</w:t>
+        <w:br/>
+        <w:t xml:space="preserve">  6. Delete task</w:t>
+        <w:br/>
+        <w:t xml:space="preserve">  7. Filter by category</w:t>
+        <w:br/>
+        <w:t xml:space="preserve">  8. Filter by status</w:t>
+        <w:br/>
+        <w:t xml:space="preserve">  9. Switch user</w:t>
+        <w:br/>
+        <w:t xml:space="preserve">  0. Exit</w:t>
+        <w:br/>
+        <w:t>&gt; _</w:t>
       </w:r>
     </w:p>
     <w:p>
@@ -1326,7 +1114,7 @@
           <w:b w:val="0"/>
           <w:sz w:val="22"/>
         </w:rPr>
-        <w:t>Figure 1. Shared GUI layout for both Java and JavaScript implementations.</w:t>
+        <w:t>Figure 1. Shared terminal menu flow for both Java and JavaScript implementations.</w:t>
       </w:r>
     </w:p>
     <w:p>
@@ -1341,7 +1129,7 @@
           <w:b w:val="0"/>
           <w:sz w:val="24"/>
         </w:rPr>
-        <w:t>The left panel displays registered users and allows switching the active user context. Filtering controls allow the active user to narrow the task list by category or status. The center panel lists all tasks with their category and status badges, along with action controls. The right section (or modal in the browser version) provides the add/edit form for task details. In Java, this layout will be implemented using JavaFX with SplitPane, ListView, and GridPane components. In JavaScript, it will be built with HTML and CSS flexbox, rendered in the browser.</w:t>
+        <w:t>In Java, terminal input and output will be handled using the Scanner class and System.out. In JavaScript, the built-in readline module will handle interactive terminal I/O via Node.js. The menu structure, prompts, and output formatting will be kept identical between both implementations so the comparison focuses on the underlying language mechanics rather than interface differences.</w:t>
       </w:r>
     </w:p>
     <w:p>
@@ -1403,7 +1191,7 @@
           <w:b w:val="0"/>
           <w:sz w:val="24"/>
         </w:rPr>
-        <w:t>Handles user creation and the concept of an active user session. In Java, this is a UserManager class. In JavaScript, it is a userManager module managing a JSON array.</w:t>
+        <w:t>Handles user creation and the concept of an active user session. In Java, a UserManager class holds an ArrayList&lt;User&gt; and tracks the current user. In JavaScript, a userManager module manages an array of user objects and the active user reference.</w:t>
       </w:r>
     </w:p>
     <w:p>
@@ -1426,7 +1214,7 @@
           <w:b w:val="0"/>
           <w:sz w:val="24"/>
         </w:rPr>
-        <w:t>Central component for all task CRUD operations (create, read, update, delete). In Java, a TaskManager class holds a synchronized ArrayList&lt;Task&gt;. In JavaScript, a taskManager module holds an array of task objects.</w:t>
+        <w:t>Central component for all task CRUD operations. In Java, a TaskManager class holds a synchronized ArrayList&lt;Task&gt; to allow safe concurrent access. In JavaScript, a taskManager module holds an array of task objects and uses async functions to simulate concurrent modification.</w:t>
       </w:r>
     </w:p>
     <w:p>
@@ -1449,7 +1237,7 @@
           <w:b w:val="0"/>
           <w:sz w:val="24"/>
         </w:rPr>
-        <w:t>Java uses a ReentrantLock or synchronized blocks around task list mutations to prevent race conditions when multiple threads access the list. JavaScript simulates concurrent users via async functions and setTimeout delays operating on a shared state object.</w:t>
+        <w:t>Java uses synchronized blocks or ReentrantLock around task list mutations to prevent race conditions when multiple threads access the list simultaneously. JavaScript simulates concurrent users via async/await and setTimeout delays operating on a shared in-memory state, demonstrating JavaScript's event-loop-based concurrency model.</w:t>
       </w:r>
     </w:p>
     <w:p>
@@ -1464,7 +1252,7 @@
           <w:b/>
           <w:sz w:val="24"/>
         </w:rPr>
-        <w:t xml:space="preserve">GUI / UI Layer: </w:t>
+        <w:t xml:space="preserve">Terminal UI / Menu: </w:t>
       </w:r>
       <w:r>
         <w:rPr>
@@ -1472,7 +1260,7 @@
           <w:b w:val="0"/>
           <w:sz w:val="24"/>
         </w:rPr>
-        <w:t>JavaFX controllers bind UI components to the underlying data model using observable properties. The JavaScript browser UI uses DOM manipulation and event listeners, with async callbacks updating the task list display.</w:t>
+        <w:t>Java implements the interactive menu using Scanner for input and System.out for output, with a loop-driven menu controller class. JavaScript implements the same menu using Node.js readline in line-by-line interactive mode, with async prompt functions chained together to handle user input.</w:t>
       </w:r>
     </w:p>
     <w:p>
@@ -1495,7 +1283,7 @@
           <w:b w:val="0"/>
           <w:sz w:val="24"/>
         </w:rPr>
-        <w:t>Both implementations are in-memory for the residency project. Java uses ArrayList&lt;Task&gt; and ArrayList&lt;User&gt;. JavaScript uses native arrays of JSON-serializable objects, which can be optionally persisted to localStorage.</w:t>
+        <w:t>Both implementations are in-memory for the residency project. Java uses ArrayList&lt;Task&gt; and ArrayList&lt;User&gt;. JavaScript uses native arrays of plain objects, which can optionally be serialized to a JSON file for persistence between sessions.</w:t>
       </w:r>
     </w:p>
     <w:p>
@@ -1643,46 +1431,6 @@
           <w:tcPr>
             <w:tcW w:type="dxa" w:w="3120"/>
           </w:tcPr>
-          <w:p/>
-        </w:tc>
-        <w:tc>
-          <w:tcPr>
-            <w:tcW w:type="dxa" w:w="3120"/>
-          </w:tcPr>
-          <w:p/>
-        </w:tc>
-        <w:tc>
-          <w:tcPr>
-            <w:tcW w:type="dxa" w:w="3120"/>
-          </w:tcPr>
-          <w:p/>
-        </w:tc>
-      </w:tr>
-      <w:tr>
-        <w:tc>
-          <w:tcPr>
-            <w:tcW w:type="dxa" w:w="3120"/>
-          </w:tcPr>
-          <w:p/>
-        </w:tc>
-        <w:tc>
-          <w:tcPr>
-            <w:tcW w:type="dxa" w:w="3120"/>
-          </w:tcPr>
-          <w:p/>
-        </w:tc>
-        <w:tc>
-          <w:tcPr>
-            <w:tcW w:type="dxa" w:w="3120"/>
-          </w:tcPr>
-          <w:p/>
-        </w:tc>
-      </w:tr>
-      <w:tr>
-        <w:tc>
-          <w:tcPr>
-            <w:tcW w:type="dxa" w:w="3120"/>
-          </w:tcPr>
           <w:p>
             <w:r>
               <w:rPr>
@@ -1705,7 +1453,7 @@
                 <w:b w:val="0"/>
                 <w:sz w:val="22"/>
               </w:rPr>
-              <w:t>JavaScript</w:t>
+              <w:t>JavaScript (Node.js)</w:t>
             </w:r>
           </w:p>
         </w:tc>
@@ -1720,7 +1468,7 @@
                 <w:b w:val="0"/>
                 <w:sz w:val="22"/>
               </w:rPr>
-              <w:t>JavaScript GUI (HTML/CSS/browser), async concurrency, JSON storage, presentation lead</w:t>
+              <w:t>Terminal UI with readline, async concurrency, JSON data structures, presentation</w:t>
             </w:r>
           </w:p>
         </w:tc>
@@ -1767,7 +1515,7 @@
                 <w:b w:val="0"/>
                 <w:sz w:val="22"/>
               </w:rPr>
-              <w:t>Java GUI (JavaFX), thread-based concurrency, OOP class design, comparison report</w:t>
+              <w:t>Terminal UI with Scanner, thread-based concurrency, OOP class design, comparison report</w:t>
             </w:r>
           </w:p>
         </w:tc>
@@ -1795,7 +1543,7 @@
           <w:b w:val="0"/>
           <w:sz w:val="24"/>
         </w:rPr>
-        <w:t>Both members will collaborate on the shared application design, data model, and GUI layout so that both implementations remain functionally equivalent. Daily coordination will occur to align feature progress and resolve any design inconsistencies between the two implementations.</w:t>
+        <w:t>Both members will collaborate on the shared application design and data model so that both implementations remain functionally equivalent. Daily coordination will occur to align feature progress and resolve any design inconsistencies between the two implementations.</w:t>
       </w:r>
     </w:p>
     <w:p>
@@ -1962,84 +1710,6 @@
           <w:tcPr>
             <w:tcW w:type="dxa" w:w="2340"/>
           </w:tcPr>
-          <w:p/>
-        </w:tc>
-        <w:tc>
-          <w:tcPr>
-            <w:tcW w:type="dxa" w:w="2340"/>
-          </w:tcPr>
-          <w:p/>
-        </w:tc>
-        <w:tc>
-          <w:tcPr>
-            <w:tcW w:type="dxa" w:w="2340"/>
-          </w:tcPr>
-          <w:p/>
-        </w:tc>
-        <w:tc>
-          <w:tcPr>
-            <w:tcW w:type="dxa" w:w="2340"/>
-          </w:tcPr>
-          <w:p/>
-        </w:tc>
-      </w:tr>
-      <w:tr>
-        <w:tc>
-          <w:tcPr>
-            <w:tcW w:type="dxa" w:w="2340"/>
-          </w:tcPr>
-          <w:p/>
-        </w:tc>
-        <w:tc>
-          <w:tcPr>
-            <w:tcW w:type="dxa" w:w="2340"/>
-          </w:tcPr>
-          <w:p/>
-        </w:tc>
-        <w:tc>
-          <w:tcPr>
-            <w:tcW w:type="dxa" w:w="2340"/>
-          </w:tcPr>
-          <w:p/>
-        </w:tc>
-        <w:tc>
-          <w:tcPr>
-            <w:tcW w:type="dxa" w:w="2340"/>
-          </w:tcPr>
-          <w:p/>
-        </w:tc>
-      </w:tr>
-      <w:tr>
-        <w:tc>
-          <w:tcPr>
-            <w:tcW w:type="dxa" w:w="2340"/>
-          </w:tcPr>
-          <w:p/>
-        </w:tc>
-        <w:tc>
-          <w:tcPr>
-            <w:tcW w:type="dxa" w:w="2340"/>
-          </w:tcPr>
-          <w:p/>
-        </w:tc>
-        <w:tc>
-          <w:tcPr>
-            <w:tcW w:type="dxa" w:w="2340"/>
-          </w:tcPr>
-          <w:p/>
-        </w:tc>
-        <w:tc>
-          <w:tcPr>
-            <w:tcW w:type="dxa" w:w="2340"/>
-          </w:tcPr>
-          <w:p/>
-        </w:tc>
-      </w:tr>
-      <w:tr>
-        <w:tc>
-          <w:tcPr>
-            <w:tcW w:type="dxa" w:w="2340"/>
-          </w:tcPr>
           <w:p>
             <w:r>
               <w:rPr>
@@ -2081,7 +1751,7 @@
               </w:rPr>
               <w:t>Finalize data model</w:t>
               <w:br/>
-              <w:t>Define GUI layout</w:t>
+              <w:t>Define terminal menu flow</w:t>
               <w:br/>
               <w:t>Set up GitHub repo</w:t>
               <w:br/>
@@ -2153,7 +1823,7 @@
               <w:br/>
               <w:t>Add/edit/delete/complete tasks</w:t>
               <w:br/>
-              <w:t>Basic GUI scaffold</w:t>
+              <w:t>Terminal menu working</w:t>
               <w:br/>
               <w:t>Concurrency implemented</w:t>
               <w:br/>
@@ -2223,8 +1893,6 @@
               </w:rPr>
               <w:t>Complete all features</w:t>
               <w:br/>
-              <w:t>Polish GUI</w:t>
-              <w:br/>
               <w:t>Write APA comparison report</w:t>
               <w:br/>
               <w:t>Build presentation slides</w:t>
@@ -2244,7 +1912,7 @@
                 <w:b w:val="0"/>
                 <w:sz w:val="22"/>
               </w:rPr>
-              <w:t>Full comparison report (2–3 pages APA 7) + presentation slides (15–20 min)</w:t>
+              <w:t>Comparison report (2-3 pages APA 7) + presentation slides (15-20 min)</w:t>
             </w:r>
           </w:p>
         </w:tc>
@@ -2286,7 +1954,7 @@
           <w:b w:val="0"/>
           <w:sz w:val="24"/>
         </w:rPr>
-        <w:t>Although both implementations will deliver equivalent functionality, the two languages approach several core problems in fundamentally different ways. The following challenges are anticipated and will be explored in depth in the Day 3 comparison report.</w:t>
+        <w:t>Although both implementations will deliver equivalent functionality, the two languages approach several core problems in fundamentally different ways. The following challenges are anticipated and will be examined in depth in the Day 3 comparison report.</w:t>
       </w:r>
     </w:p>
     <w:p>
@@ -2309,7 +1977,7 @@
           <w:b w:val="0"/>
           <w:sz w:val="24"/>
         </w:rPr>
-        <w:t>Java's static type system requires explicit class definitions with typed fields, enforced at compile time. JavaScript's dynamic typing allows ad hoc object construction but requires careful discipline to maintain consistent structure across task objects.</w:t>
+        <w:t>Java's static type system requires explicit class definitions with typed fields enforced at compile time. JavaScript's dynamic typing allows flexible object construction but requires careful discipline to maintain consistent structure across task objects at runtime.</w:t>
       </w:r>
     </w:p>
     <w:p>
@@ -2332,7 +2000,7 @@
           <w:b w:val="0"/>
           <w:sz w:val="24"/>
         </w:rPr>
-        <w:t>Java's thread-based concurrency introduces the risk of race conditions when multiple threads modify the shared task list. Proper use of synchronized blocks or ReentrantLock is required. JavaScript's single-threaded event loop with async/await avoids true race conditions but requires careful sequencing of asynchronous operations to simulate concurrent user interactions.</w:t>
+        <w:t>Java's thread-based concurrency introduces the risk of race conditions when multiple threads modify the shared task list, requiring synchronized blocks or ReentrantLock. JavaScript's single-threaded event loop with async/await avoids true race conditions but requires deliberate sequencing of asynchronous operations to realistically simulate concurrent user interactions.</w:t>
       </w:r>
     </w:p>
     <w:p>
@@ -2347,7 +2015,7 @@
           <w:b/>
           <w:sz w:val="24"/>
         </w:rPr>
-        <w:t xml:space="preserve">GUI Framework Differences: </w:t>
+        <w:t xml:space="preserve">Terminal I/O: </w:t>
       </w:r>
       <w:r>
         <w:rPr>
@@ -2355,7 +2023,7 @@
           <w:b w:val="0"/>
           <w:sz w:val="24"/>
         </w:rPr>
-        <w:t>JavaFX uses a scene graph model with FXML or programmatic layout, event handlers, and observable properties. The JavaScript browser UI uses the DOM, CSS, and event listeners — a fundamentally different paradigm that separates structure (HTML), style (CSS), and behavior (JS). Achieving a visually equivalent layout requires deliberate coordination of both approaches.</w:t>
+        <w:t>Java's Scanner provides synchronous, blocking input which pairs naturally with a loop-driven menu. Node.js readline is inherently asynchronous; building a sequential interactive menu requires careful use of async/await or callback chaining to avoid non-intuitive control flow.</w:t>
       </w:r>
     </w:p>
     <w:p>
@@ -2378,7 +2046,7 @@
           <w:b w:val="0"/>
           <w:sz w:val="24"/>
         </w:rPr>
-        <w:t>Java requires enumerations and strongly typed value classes for Category and Status. JavaScript represents these as string constants, which is simpler but less safe. Ensuring consistent validation on the JavaScript side will require additional discipline.</w:t>
+        <w:t>Java requires enumerations and strongly typed value classes for Category and Status. JavaScript represents these as string constants, which is more flexible but requires manual validation. Ensuring consistent behavior on the JavaScript side will require additional discipline since the language will not catch type errors at compile time.</w:t>
       </w:r>
     </w:p>
     <w:p>
@@ -2401,7 +2069,7 @@
           <w:b w:val="0"/>
           <w:sz w:val="24"/>
         </w:rPr>
-        <w:t>Java uses checked and unchecked exceptions with try-catch-finally blocks. JavaScript uses try-catch for synchronous code and Promise rejection (.catch() or try-catch inside async functions) for asynchronous paths. The two models handle error propagation quite differently, especially across concurrent operations.</w:t>
+        <w:t>Java uses checked and unchecked exceptions with try-catch-finally blocks, and the compiler enforces handling of checked exceptions. JavaScript uses try-catch for synchronous code and Promise rejection handling for asynchronous paths, with no compile-time enforcement, making thorough testing more important.</w:t>
       </w:r>
     </w:p>
     <w:p>
@@ -2483,68 +2151,6 @@
           <w:b w:val="0"/>
           <w:sz w:val="24"/>
         </w:rPr>
-        <w:t xml:space="preserve">Oracle. (2024). </w:t>
-      </w:r>
-      <w:r>
-        <w:rPr>
-          <w:rFonts w:ascii="Times New Roman" w:hAnsi="Times New Roman"/>
-          <w:b w:val="0"/>
-          <w:i/>
-          <w:sz w:val="24"/>
-        </w:rPr>
-        <w:t>JavaFX overview.</w:t>
-      </w:r>
-      <w:r>
-        <w:rPr>
-          <w:rFonts w:ascii="Times New Roman" w:hAnsi="Times New Roman"/>
-          <w:b w:val="0"/>
-          <w:sz w:val="24"/>
-        </w:rPr>
-        <w:t xml:space="preserve"> Oracle Help Center. https://openjfx.io</w:t>
-      </w:r>
-    </w:p>
-    <w:p>
-      <w:pPr>
-        <w:spacing w:after="120"/>
-        <w:ind w:hanging="720" w:left="720"/>
-      </w:pPr>
-      <w:r>
-        <w:rPr>
-          <w:rFonts w:ascii="Times New Roman" w:hAnsi="Times New Roman"/>
-          <w:b w:val="0"/>
-          <w:sz w:val="24"/>
-        </w:rPr>
-        <w:t xml:space="preserve">MDN Web Docs. (2024). </w:t>
-      </w:r>
-      <w:r>
-        <w:rPr>
-          <w:rFonts w:ascii="Times New Roman" w:hAnsi="Times New Roman"/>
-          <w:b w:val="0"/>
-          <w:i/>
-          <w:sz w:val="24"/>
-        </w:rPr>
-        <w:t>Using promises.</w:t>
-      </w:r>
-      <w:r>
-        <w:rPr>
-          <w:rFonts w:ascii="Times New Roman" w:hAnsi="Times New Roman"/>
-          <w:b w:val="0"/>
-          <w:sz w:val="24"/>
-        </w:rPr>
-        <w:t xml:space="preserve"> Mozilla Developer Network. https://developer.mozilla.org/en-US/docs/Web/JavaScript/Guide/Using_promises</w:t>
-      </w:r>
-    </w:p>
-    <w:p>
-      <w:pPr>
-        <w:spacing w:after="120"/>
-        <w:ind w:hanging="720" w:left="720"/>
-      </w:pPr>
-      <w:r>
-        <w:rPr>
-          <w:rFonts w:ascii="Times New Roman" w:hAnsi="Times New Roman"/>
-          <w:b w:val="0"/>
-          <w:sz w:val="24"/>
-        </w:rPr>
         <w:t xml:space="preserve">Bloch, J. (2018). </w:t>
       </w:r>
       <w:r>
@@ -2594,6 +2200,68 @@
           <w:sz w:val="24"/>
         </w:rPr>
         <w:t xml:space="preserve"> (7th ed.). O'Reilly Media.</w:t>
+      </w:r>
+    </w:p>
+    <w:p>
+      <w:pPr>
+        <w:spacing w:after="120"/>
+        <w:ind w:hanging="720" w:left="720"/>
+      </w:pPr>
+      <w:r>
+        <w:rPr>
+          <w:rFonts w:ascii="Times New Roman" w:hAnsi="Times New Roman"/>
+          <w:b w:val="0"/>
+          <w:sz w:val="24"/>
+        </w:rPr>
+        <w:t xml:space="preserve">Node.js Foundation. (2024). </w:t>
+      </w:r>
+      <w:r>
+        <w:rPr>
+          <w:rFonts w:ascii="Times New Roman" w:hAnsi="Times New Roman"/>
+          <w:b w:val="0"/>
+          <w:i/>
+          <w:sz w:val="24"/>
+        </w:rPr>
+        <w:t>readline: Readline module.</w:t>
+      </w:r>
+      <w:r>
+        <w:rPr>
+          <w:rFonts w:ascii="Times New Roman" w:hAnsi="Times New Roman"/>
+          <w:b w:val="0"/>
+          <w:sz w:val="24"/>
+        </w:rPr>
+        <w:t xml:space="preserve"> Node.js Documentation. https://nodejs.org/api/readline.html</w:t>
+      </w:r>
+    </w:p>
+    <w:p>
+      <w:pPr>
+        <w:spacing w:after="120"/>
+        <w:ind w:hanging="720" w:left="720"/>
+      </w:pPr>
+      <w:r>
+        <w:rPr>
+          <w:rFonts w:ascii="Times New Roman" w:hAnsi="Times New Roman"/>
+          <w:b w:val="0"/>
+          <w:sz w:val="24"/>
+        </w:rPr>
+        <w:t xml:space="preserve">Oracle. (2024). </w:t>
+      </w:r>
+      <w:r>
+        <w:rPr>
+          <w:rFonts w:ascii="Times New Roman" w:hAnsi="Times New Roman"/>
+          <w:b w:val="0"/>
+          <w:i/>
+          <w:sz w:val="24"/>
+        </w:rPr>
+        <w:t>Class Scanner.</w:t>
+      </w:r>
+      <w:r>
+        <w:rPr>
+          <w:rFonts w:ascii="Times New Roman" w:hAnsi="Times New Roman"/>
+          <w:b w:val="0"/>
+          <w:sz w:val="24"/>
+        </w:rPr>
+        <w:t xml:space="preserve"> Java SE 21 API Documentation. https://docs.oracle.com/en/java/docs/api/java.base/java/util/Scanner.html</w:t>
       </w:r>
     </w:p>
     <w:sectPr>

</xml_diff>

<commit_message>
Day 1: Remove abstract from design report (not used in APA 7 student papers)
</commit_message>
<xml_diff>
--- a/Pelushi_Peng_MSCS632_Residency_Day1_Design.docx
+++ b/Pelushi_Peng_MSCS632_Residency_Day1_Design.docx
@@ -131,45 +131,6 @@
     <w:p>
       <w:r>
         <w:br w:type="page"/>
-      </w:r>
-    </w:p>
-    <w:p>
-      <w:pPr>
-        <w:spacing w:after="0"/>
-        <w:jc w:val="center"/>
-      </w:pPr>
-      <w:r>
-        <w:rPr>
-          <w:rFonts w:ascii="Times New Roman" w:hAnsi="Times New Roman"/>
-          <w:b/>
-          <w:sz w:val="24"/>
-        </w:rPr>
-        <w:t>Abstract</w:t>
-      </w:r>
-    </w:p>
-    <w:p>
-      <w:pPr>
-        <w:spacing w:after="0"/>
-        <w:ind w:firstLine="720"/>
-        <w:jc w:val="both"/>
-      </w:pPr>
-      <w:r>
-        <w:rPr>
-          <w:rFonts w:ascii="Times New Roman" w:hAnsi="Times New Roman"/>
-          <w:b w:val="0"/>
-          <w:sz w:val="24"/>
-        </w:rPr>
-        <w:t>This document presents the initial planning and design for a Collaborative To-Do List Application developed as part of the MSCS-632 Residency Weekend Group Project. The application will be implemented independently in two programming languages — Java and JavaScript — with functionally identical behavior delivered through an interactive terminal interface. This report outlines the application architecture, data model, terminal UI design, team role assignments, project timeline, and anticipated language-specific challenges.</w:t>
-      </w:r>
-    </w:p>
-    <w:p>
-      <w:pPr>
-        <w:spacing w:before="0" w:after="0"/>
-      </w:pPr>
-      <w:r>
-        <w:rPr>
-          <w:sz w:val="24"/>
-        </w:rPr>
       </w:r>
     </w:p>
     <w:p>

</xml_diff>